<commit_message>
Add empirical status updates to Working Model and Overview documents
Dated status boxes (2026-07-04) noting: the P(k)/CMB program has been
executed and constrains the coupled Model A branch (Planck TT bound
c <= ~0.047; primordial deviations < ~0.6% rms; LCDM-matching limit is
the decoupling limit); galaxy-scale predictions remain open; the MID
eigenmode differs from the UCP template (rel. L2 ~ 0.72); the early
MOND comparison is retracted. Points readers to reproducibility/.

Co-Authored-By: Claude Fable 5 <noreply@anthropic.com>
</commit_message>
<xml_diff>
--- a/Genesis Field Theory - Working Model.docx
+++ b/Genesis Field Theory - Working Model.docx
@@ -21,17 +21,37 @@
     <w:p>
       <w:r>
         <w:t>A Unified Physical Formulation of the Genesis Field</w:t>
-      </w:r>
-      <w:r>
         <w:br/>
       </w:r>
     </w:p>
     <w:p>
       <w:r>
-        <w:t xml:space="preserve">This document provides the complete mathematical and conceptual foundation for Genesis </w:t>
+        <w:t>This document provides the complete mathematical and conceptual foundation for Genesis Field Theory. It defines the physical field, governing equations, spectral structure, gravitational coupling, and predictions. Unlike the Overview—which explains the motivation and conceptual intuition—this Working Model establishes the formal physics structure of the theory.</w:t>
+      </w:r>
+    </w:p>
+    <w:p>
+      <w:pPr>
+        <w:pBdr>
+          <w:top w:val="single" w:sz="12" w:space="4" w:color="1F4E79"/>
+          <w:left w:val="single" w:sz="12" w:space="4" w:color="1F4E79"/>
+          <w:bottom w:val="single" w:sz="12" w:space="4" w:color="1F4E79"/>
+          <w:right w:val="single" w:sz="12" w:space="4" w:color="1F4E79"/>
+        </w:pBdr>
+        <w:shd w:val="clear" w:color="auto" w:fill="EAF1FB"/>
+      </w:pPr>
+      <w:r>
+        <w:rPr>
+          <w:b/>
+          <w:bCs/>
+          <w:color w:val="1F4E79"/>
+        </w:rPr>
+        <w:t xml:space="preserve">EMPIRICAL STATUS UPDATE (2026-07-04). </w:t>
       </w:r>
       <w:r>
-        <w:t>Field Theory. It defines the physical field, governing equations, spectral structure, gravitational coupling, and predictions. Unlike the Overview—which explains the motivation and conceptual intuition—this Working Model establishes the formal physics structure of the theory.</w:t>
+        <w:rPr>
+          <w:color w:val="1F4E79"/>
+        </w:rPr>
+        <w:t>The cosmological P(k) derivation listed under Future Extensions (Section 8) has since been carried out via the GenesisFT–CAMB pipeline and tested against the Planck 2018 binned TT spectrum. Result: the kernel-vacuum Model A implementation is excluded wherever the operator spectrum measurably influences the primordial spectrum (coupling bound c ≲ 0.047 at a₂ = 8000); the configuration that matches Planck is the decoupling limit, identical to ΛCDM by construction. Any GenesisFT imprint on Pζ(k) must be ≲ 0.6% rms. The galaxy-scale predictions of Section 7 (cored halos, oscillatory rotation-curve features, lensing cores) are unaffected by this bound and remain open. Separately, the verified lensing-consistent MID-band eigenmode differs from the UCP template by relative L2 ≈ 0.72 — realistic halos are UV/MID/IR composites. Full analysis and replication instructions: the reproducibility folder of this repository (reproducibility/docs/GenesisFT_ModelA_Planck2018_TT_Validation_Report.docx).</w:t>
       </w:r>
     </w:p>
     <w:p>
@@ -119,39 +139,19 @@
     <w:p>
       <w:r>
         <w:t>The spatial operator Ô defines the structural spectrum of the Genesis Field. It is expressed as:</w:t>
-      </w:r>
-      <w:r>
         <w:br/>
-      </w:r>
-      <w:r>
         <w:br/>
         <w:t>(1) Ô = -∇² + V_eff(x)</w:t>
-      </w:r>
-      <w:r>
         <w:br/>
-      </w:r>
-      <w:r>
         <w:br/>
         <w:t>Its eigenmodes satisfy:</w:t>
-      </w:r>
-      <w:r>
         <w:br/>
-      </w:r>
-      <w:r>
         <w:br/>
         <w:t>(2) Ô χₙ(x) = λₙ χₙ(x)</w:t>
-      </w:r>
-      <w:r>
         <w:br/>
-      </w:r>
-      <w:r>
         <w:br/>
         <w:t>These eigenmodes naturally fall into stability bands. The field Φ(x,t) decomposes as:</w:t>
-      </w:r>
-      <w:r>
         <w:br/>
-      </w:r>
-      <w:r>
         <w:br/>
         <w:t>(3) Φ(x, t) = Σ aₙ(t) χₙ(x)</w:t>
       </w:r>
@@ -223,41 +223,21 @@
     <w:p>
       <w:r>
         <w:t>The complete dynamics of the Genesis Field are governed by the Lagrangian density:</w:t>
-      </w:r>
-      <w:r>
         <w:br/>
-      </w:r>
-      <w:r>
         <w:br/>
         <w:t>(4) L = 1/2 (∂_μΦ ∂^μΦ) − 1/2 m²Φ² − 1/2 Φ Ô Φ − V(Φ)</w:t>
-      </w:r>
-      <w:r>
         <w:br/>
-      </w:r>
-      <w:r>
         <w:br/>
         <w:t>This unifies:</w:t>
-      </w:r>
-      <w:r>
         <w:br/>
         <w:t>• classical wave propagation</w:t>
-      </w:r>
-      <w:r>
         <w:br/>
         <w:t>• an intrinsic mass scale</w:t>
-      </w:r>
-      <w:r>
         <w:br/>
         <w:t>• the spectral geometry encoded in Ô</w:t>
-      </w:r>
-      <w:r>
         <w:br/>
         <w:t>• optional self-interactions through V(Φ)</w:t>
-      </w:r>
-      <w:r>
         <w:br/>
-      </w:r>
-      <w:r>
         <w:br/>
         <w:t>This Lagrangian is the mathematical heart of GenesisFT.</w:t>
       </w:r>
@@ -273,34 +253,18 @@
     <w:p>
       <w:r>
         <w:t>Applying the Euler–Lagrange equation yields the Genesis Field Equation:</w:t>
-      </w:r>
-      <w:r>
         <w:br/>
-      </w:r>
-      <w:r>
         <w:br/>
         <w:t>(5) ∂²Φ/∂t² − ∇²Φ + m²Φ + ÔΦ + dV/dΦ = 0</w:t>
-      </w:r>
-      <w:r>
         <w:br/>
-      </w:r>
-      <w:r>
         <w:br/>
         <w:t>Interpretation:</w:t>
-      </w:r>
-      <w:r>
         <w:br/>
         <w:t>• The first two terms describe standard wave propagation.</w:t>
-      </w:r>
-      <w:r>
         <w:br/>
         <w:t>• m²Φ provides harmonic restoring behavior.</w:t>
-      </w:r>
-      <w:r>
         <w:br/>
         <w:t>• ÔΦ introduces the spectral band structure.</w:t>
-      </w:r>
-      <w:r>
         <w:br/>
         <w:t>• dV/dΦ describes self-interaction.</w:t>
       </w:r>
@@ -317,32 +281,16 @@
     <w:p>
       <w:r>
         <w:t>Φ interacts gravitationally through the stress-energy tensor:</w:t>
-      </w:r>
-      <w:r>
         <w:br/>
-      </w:r>
-      <w:r>
         <w:br/>
         <w:t>(6) T_{μν} = ∂_μΦ ∂_νΦ − g_{μν} L</w:t>
-      </w:r>
-      <w:r>
         <w:br/>
-      </w:r>
-      <w:r>
         <w:br/>
         <w:t>In the Newtonian limit applicable to galaxies, gravity obeys:</w:t>
-      </w:r>
-      <w:r>
         <w:br/>
-      </w:r>
-      <w:r>
         <w:br/>
         <w:t>(7) ∇²Φ_grav = 4πG ρ_eff</w:t>
-      </w:r>
-      <w:r>
         <w:br/>
-      </w:r>
-      <w:r>
         <w:br/>
         <w:t>where ρ_eff is dominated by MID-band contributions that behave as dark matter.</w:t>
       </w:r>
@@ -413,12 +361,8 @@
     <w:p>
       <w:r>
         <w:t>• IR Band — large-scale, slowly varying modes; govern cosmic background smoothness.</w:t>
-      </w:r>
-      <w:r>
         <w:br/>
         <w:t>• MID Band — intermediate modes; form stable standing-wave structures behaving as dark matter.</w:t>
-      </w:r>
-      <w:r>
         <w:br/>
         <w:t>• UV Band — high-frequency modes; influence small-scale corrections and microstructure.</w:t>
       </w:r>
@@ -434,34 +378,17 @@
     <w:p>
       <w:r>
         <w:t>From the GenesisFT field equation and spectral structure, the following predictions arise:</w:t>
-      </w:r>
-      <w:r>
         <w:br/>
-      </w:r>
-      <w:r>
         <w:br/>
-        <w:t xml:space="preserve">1. Cored </w:t>
-      </w:r>
-      <w:r>
-        <w:t>galactic halos formed naturally by wave pressure.</w:t>
-      </w:r>
-      <w:r>
+        <w:t>1. Cored galactic halos formed naturally by wave pressure.</w:t>
         <w:br/>
         <w:t>2. Oscillatory rotation curve features due to mode interference.</w:t>
-      </w:r>
-      <w:r>
         <w:br/>
         <w:t>3. Suppression of small-scale halo formation.</w:t>
-      </w:r>
-      <w:r>
         <w:br/>
         <w:t>4. Lens profiles shaped by finite-density cores.</w:t>
-      </w:r>
-      <w:r>
         <w:br/>
         <w:t>5. Scaling relations between halo mass and radius derived from eigenvalue quantization.</w:t>
-      </w:r>
-      <w:r>
         <w:br/>
       </w:r>
     </w:p>
@@ -477,24 +404,14 @@
     <w:p>
       <w:r>
         <w:t>Future developments include:</w:t>
-      </w:r>
-      <w:r>
         <w:br/>
         <w:t>• Analytical solutions for static halo configurations.</w:t>
-      </w:r>
-      <w:r>
         <w:br/>
         <w:t>• Derivation of GenesisFT cosmological power spectrum P(k).</w:t>
-      </w:r>
-      <w:r>
         <w:br/>
         <w:t>• Extension to early-universe behavior and inflation-like regimes.</w:t>
-      </w:r>
-      <w:r>
         <w:br/>
         <w:t>• Numerical N-body simulations using the Genesis Field Equation.</w:t>
-      </w:r>
-      <w:r>
         <w:br/>
       </w:r>
     </w:p>

</xml_diff>